<commit_message>
v1.0 release framing: root README (public face of the versioned compendium archive: contents map, status discipline, curation summary, citation guidance); RELEASE_NOTES.md (release record: preprint relabel, 156-row concordance routing, E1/E2 direct destinations, full curation log with retrieval pointers, verification status, known limitations); monograph relabeled 'Working manuscript' → 'Working preprint — version 1.0' with preprint-status block (citable record ahead of peer review; no results beyond the proof corpus; supersession path via the Wave-3 monograph) and suggested-citation block; docx regenerated
</commit_message>
<xml_diff>
--- a/revised_sustainability_manuscript.docx
+++ b/revised_sustainability_manuscript.docx
@@ -26,7 +26,7 @@
         <w:rPr>
           <w:b/>
         </w:rPr>
-        <w:t>Working manuscript</w:t>
+        <w:t>Working preprint — version 1.0</w:t>
       </w:r>
     </w:p>
     <w:p>
@@ -37,7 +37,7 @@
         <w:t>Date:</w:t>
       </w:r>
       <w:r>
-        <w:t xml:space="preserve"> 17 August 2026</w:t>
+        <w:t xml:space="preserve"> 17 August 2026 (text); 26 August 2026 (v1.0 release)</w:t>
       </w:r>
     </w:p>
     <w:p>
@@ -49,6 +49,37 @@
       </w:r>
       <w:r>
         <w:t xml:space="preserve"> [Author name]</w:t>
+      </w:r>
+    </w:p>
+    <w:p>
+      <w:pPr>
+        <w:spacing w:before="120" w:after="120"/>
+        <w:ind w:left="504" w:right="360"/>
+      </w:pPr>
+      <w:r>
+        <w:rPr>
+          <w:i/>
+          <w:color w:val="2F5D73"/>
+        </w:rPr>
+        <w:t>**Preprint status.** This document is released as a clearly labeled **working preprint**: a public, citable record of the programme's architectural kernel ahead of peer review. It is a candidate architectural kernel and composition language (Box 1); it does not claim a completed universal law, and it contains no mathematical results beyond the programme's proof corpus — every formal statement traces to the corrected articles (A001–A025) or to the registered proof records (`PROOF_MANIFEST.md`). The peer-reviewed mathematics will appear in the journal papers of the publication architecture (`batch 2/03_publication_strategy/PUBLICATION_STRATEGY.md`); if the definitive monograph is written after those papers pass external scrutiny, this preprint will be updated or superseded by it. Version history: v0.1 → v0.2 → working manuscript of 14 August 2026 → this version.</w:t>
+      </w:r>
+    </w:p>
+    <w:p>
+      <w:r>
+        <w:t>&gt;</w:t>
+      </w:r>
+    </w:p>
+    <w:p>
+      <w:pPr>
+        <w:spacing w:before="120" w:after="120"/>
+        <w:ind w:left="504" w:right="360"/>
+      </w:pPr>
+      <w:r>
+        <w:rPr>
+          <w:i/>
+          <w:color w:val="2F5D73"/>
+        </w:rPr>
+        <w:t>**Suggested citation.** [Author name]. *Toward a General Theory of Sustainability: An Architectural Kernel and Composition Language for Ecological, Economic, and Social Systems.* Working preprint v1.0, August 2026. General-sustainability programme archive, companion register `PROOF_MANIFEST.md`.</w:t>
       </w:r>
     </w:p>
     <w:p>

</xml_diff>